<commit_message>
Rewording and Video Prep
</commit_message>
<xml_diff>
--- a/Resources/Week 9 Video/Video Script.docx
+++ b/Resources/Week 9 Video/Video Script.docx
@@ -61,7 +61,15 @@
         <w:t>We created and</w:t>
       </w:r>
       <w:r>
-        <w:t xml:space="preserve"> prioritised user stories using the MoSCoW method.</w:t>
+        <w:t xml:space="preserve"> prioritised user stories using the </w:t>
+      </w:r>
+      <w:proofErr w:type="spellStart"/>
+      <w:r>
+        <w:t>MoSCoW</w:t>
+      </w:r>
+      <w:proofErr w:type="spellEnd"/>
+      <w:r>
+        <w:t xml:space="preserve"> method.</w:t>
       </w:r>
     </w:p>
     <w:p>
@@ -131,7 +139,32 @@
           <w:u w:val="single"/>
         </w:rPr>
       </w:pPr>
+      <w:r>
+        <w:rPr>
+          <w:b/>
+          <w:bCs/>
+          <w:u w:val="single"/>
+        </w:rPr>
+        <w:t xml:space="preserve">Team Planning </w:t>
+      </w:r>
+      <w:r>
+        <w:rPr>
+          <w:b/>
+          <w:bCs/>
+          <w:u w:val="single"/>
+        </w:rPr>
+        <w:t>–</w:t>
+      </w:r>
+      <w:r>
+        <w:rPr>
+          <w:b/>
+          <w:bCs/>
+          <w:u w:val="single"/>
+        </w:rPr>
+        <w:t xml:space="preserve"> Jira</w:t>
+      </w:r>
     </w:p>
+    <w:p/>
     <w:sectPr>
       <w:pgSz w:w="11906" w:h="16838"/>
       <w:pgMar w:top="1440" w:right="1440" w:bottom="1440" w:left="1440" w:header="708" w:footer="708" w:gutter="0"/>
@@ -745,7 +778,6 @@
   <w:style w:type="character" w:default="1" w:styleId="DefaultParagraphFont">
     <w:name w:val="Default Paragraph Font"/>
     <w:uiPriority w:val="1"/>
-    <w:semiHidden/>
     <w:unhideWhenUsed/>
   </w:style>
   <w:style w:type="table" w:default="1" w:styleId="TableNormal">

</xml_diff>